<commit_message>
update: final finish project
</commit_message>
<xml_diff>
--- a/ket_qua/09_Bao_cao_tien_do/Bao_cao_tien_do_KT.docx
+++ b/ket_qua/09_Bao_cao_tien_do/Bao_cao_tien_do_KT.docx
@@ -458,7 +458,7 @@
                 <w:color w:val="000000"/>
                 <w:sz w:val="24"/>
               </w:rPr>
-              <w:t>0.1</w:t>
+              <w:t>0.2</w:t>
             </w:r>
           </w:p>
         </w:tc>
@@ -1008,7 +1008,7 @@
                 <w:color w:val="000000"/>
                 <w:sz w:val="24"/>
               </w:rPr>
-              <w:t>736,75/908,00 MD (81,1%)</w:t>
+              <w:t>736,75/921,00 MD (80,0%)</w:t>
             </w:r>
           </w:p>
         </w:tc>
@@ -1222,7 +1222,7 @@
           <w:color w:val="000000"/>
           <w:sz w:val="26"/>
         </w:rPr>
-        <w:t>Ngày hoàn thành dự báo 29/07/2027, không muộn hơn ngày cut over 29/07/2027 theo phụ lục hợp đồng, TCPI 0,00. Tỷ lệ sử dụng quỹ huy động đạt 81,1%, còn 171,25 MD sẵn sàng không ghi công trên 908,00 MD huy động. Chi phí khác đã chi lũy kế 60.000.000 đồng, EAC theo chi phí thực 1.486,37 triệu đồng.</w:t>
+        <w:t>Ngày hoàn thành dự báo 29/07/2027, không muộn hơn ngày cut over 29/07/2027 theo phụ lục hợp đồng, TCPI 0,00. Tỷ lệ sử dụng quỹ huy động đạt 80,0%, còn 184,25 MD sẵn sàng không ghi công trên 921,00 MD huy động. Chi phí khác đã chi lũy kế 60.000.000 đồng, EAC theo chi phí thực 1.486,37 triệu đồng.</w:t>
       </w:r>
     </w:p>
     <w:p>
@@ -2694,7 +2694,7 @@
                 <w:color w:val="000000"/>
                 <w:sz w:val="24"/>
               </w:rPr>
-              <w:t>736,75, 171,25 (81,1% quỹ huy động có ghi công)</w:t>
+              <w:t>736,75, 184,25 (80,0% quỹ huy động có ghi công)</w:t>
             </w:r>
           </w:p>
         </w:tc>
@@ -2719,7 +2719,7 @@
           <w:color w:val="000000"/>
           <w:sz w:val="26"/>
         </w:rPr>
-        <w:t>Cách trả lương do nhóm khai báo: trả theo công sức (MD công việc). EV nhân sự và AC nhân sự cùng cơ sở lương với cost estimate (lương tham chiếu tháng chia 22 ngày, nhân hệ số bảo hiểm 1,235). Khi thực hiện đúng kế hoạch, EV nhân sự bằng lương kế hoạch đến ngày báo cáo và CPI theo chi phí thực bằng 1. Chi phí khác chưa có kế hoạch chi theo thời gian nên so với dự toán, không tính vào CPI theo chi phí thực. Đến ngày báo cáo đã huy động 908,00 MD, lương của toàn bộ ngày huy động cả dự án là 1.640.136.136 đồng. Ngày sẵn sàng không ghi công không tính lương, chỉ dùng để theo dõi năng lực.</w:t>
+        <w:t>Cách trả lương do nhóm khai báo: trả theo công sức (MD công việc). EV nhân sự và AC nhân sự cùng cơ sở lương với cost estimate (lương tham chiếu tháng chia 22 ngày, nhân hệ số bảo hiểm 1,235). Khi thực hiện đúng kế hoạch, EV nhân sự bằng lương kế hoạch đến ngày báo cáo và CPI theo chi phí thực bằng 1. Chi phí khác chưa có kế hoạch chi theo thời gian nên so với dự toán, không tính vào CPI theo chi phí thực. Đến ngày báo cáo đã huy động 921,00 MD, lương của toàn bộ ngày huy động cả dự án là 1.640.136.136 đồng. Ngày sẵn sàng không ghi công không tính lương, chỉ dùng để theo dõi năng lực.</w:t>
       </w:r>
     </w:p>
     <w:tbl>
@@ -6967,7 +6967,7 @@
                 <w:color w:val="000000"/>
                 <w:sz w:val="24"/>
               </w:rPr>
-              <w:t>69,00</w:t>
+              <w:t>70,50</w:t>
             </w:r>
           </w:p>
         </w:tc>
@@ -6989,7 +6989,7 @@
                 <w:color w:val="000000"/>
                 <w:sz w:val="24"/>
               </w:rPr>
-              <w:t>18,75</w:t>
+              <w:t>20,25</w:t>
             </w:r>
           </w:p>
         </w:tc>
@@ -7101,7 +7101,7 @@
                 <w:color w:val="000000"/>
                 <w:sz w:val="24"/>
               </w:rPr>
-              <w:t>71,00</w:t>
+              <w:t>72,00</w:t>
             </w:r>
           </w:p>
         </w:tc>
@@ -7123,7 +7123,7 @@
                 <w:color w:val="000000"/>
                 <w:sz w:val="24"/>
               </w:rPr>
-              <w:t>13,50</w:t>
+              <w:t>14,50</w:t>
             </w:r>
           </w:p>
         </w:tc>
@@ -7369,7 +7369,7 @@
                 <w:color w:val="000000"/>
                 <w:sz w:val="24"/>
               </w:rPr>
-              <w:t>83,00</w:t>
+              <w:t>84,00</w:t>
             </w:r>
           </w:p>
         </w:tc>
@@ -7391,7 +7391,7 @@
                 <w:color w:val="000000"/>
                 <w:sz w:val="24"/>
               </w:rPr>
-              <w:t>9,75</w:t>
+              <w:t>10,75</w:t>
             </w:r>
           </w:p>
         </w:tc>
@@ -7637,7 +7637,7 @@
                 <w:color w:val="000000"/>
                 <w:sz w:val="24"/>
               </w:rPr>
-              <w:t>85,00</w:t>
+              <w:t>86,00</w:t>
             </w:r>
           </w:p>
         </w:tc>
@@ -7659,7 +7659,7 @@
                 <w:color w:val="000000"/>
                 <w:sz w:val="24"/>
               </w:rPr>
-              <w:t>18,00</w:t>
+              <w:t>19,00</w:t>
             </w:r>
           </w:p>
         </w:tc>
@@ -7771,7 +7771,7 @@
                 <w:color w:val="000000"/>
                 <w:sz w:val="24"/>
               </w:rPr>
-              <w:t>77,00</w:t>
+              <w:t>78,00</w:t>
             </w:r>
           </w:p>
         </w:tc>
@@ -7793,7 +7793,7 @@
                 <w:color w:val="000000"/>
                 <w:sz w:val="24"/>
               </w:rPr>
-              <w:t>12,75</w:t>
+              <w:t>13,75</w:t>
             </w:r>
           </w:p>
         </w:tc>
@@ -8039,7 +8039,7 @@
                 <w:color w:val="000000"/>
                 <w:sz w:val="24"/>
               </w:rPr>
-              <w:t>70,00</w:t>
+              <w:t>72,00</w:t>
             </w:r>
           </w:p>
         </w:tc>
@@ -8061,7 +8061,7 @@
                 <w:color w:val="000000"/>
                 <w:sz w:val="24"/>
               </w:rPr>
-              <w:t>20,25</w:t>
+              <w:t>22,25</w:t>
             </w:r>
           </w:p>
         </w:tc>
@@ -8173,7 +8173,7 @@
                 <w:color w:val="000000"/>
                 <w:sz w:val="24"/>
               </w:rPr>
-              <w:t>63,00</w:t>
+              <w:t>66,00</w:t>
             </w:r>
           </w:p>
         </w:tc>
@@ -8195,7 +8195,7 @@
                 <w:color w:val="000000"/>
                 <w:sz w:val="24"/>
               </w:rPr>
-              <w:t>13,75</w:t>
+              <w:t>16,75</w:t>
             </w:r>
           </w:p>
         </w:tc>
@@ -8307,7 +8307,7 @@
                 <w:color w:val="000000"/>
                 <w:sz w:val="24"/>
               </w:rPr>
-              <w:t>62,00</w:t>
+              <w:t>64,50</w:t>
             </w:r>
           </w:p>
         </w:tc>
@@ -8329,7 +8329,7 @@
                 <w:color w:val="000000"/>
                 <w:sz w:val="24"/>
               </w:rPr>
-              <w:t>3,25</w:t>
+              <w:t>5,75</w:t>
             </w:r>
           </w:p>
         </w:tc>
@@ -8441,7 +8441,7 @@
                 <w:color w:val="000000"/>
                 <w:sz w:val="24"/>
               </w:rPr>
-              <w:t>908,00</w:t>
+              <w:t>921,00</w:t>
             </w:r>
           </w:p>
         </w:tc>
@@ -8463,7 +8463,7 @@
                 <w:color w:val="000000"/>
                 <w:sz w:val="24"/>
               </w:rPr>
-              <w:t>171,25</w:t>
+              <w:t>184,25</w:t>
             </w:r>
           </w:p>
         </w:tc>

</xml_diff>